<commit_message>
updated status messages on chapter 2 to match chapter 1
</commit_message>
<xml_diff>
--- a/02_Literature_Review/Chapter_2_Literature_Review Revised.docx
+++ b/02_Literature_Review/Chapter_2_Literature_Review Revised.docx
@@ -30,55 +30,15 @@
     </w:p>
     <w:p>
       <w:r>
-        <w:t xml:space="preserve">This chapter reviews research, existing software and relevant technologies related to Work-Integrated Learning (WIL) documentation and progress monitoring. The review considers how digital systems support students, workplace mentors, coordinators and lecturers, and identifies features that can inform the design of </w:t>
-      </w:r>
-      <w:proofErr w:type="spellStart"/>
-      <w:r>
-        <w:t>TrackWI</w:t>
+        <w:t>This chapter reviews research, existing software and relevant technologies related to Work-Integrated Learning (WIL) documentation and progress monitoring. The review considers how digital systems support students, workplace mentors, coordinators and lecturers, and identifies features that can inform the design of TrackWI</w:t>
       </w:r>
       <w:r>
-        <w:t>L</w:t>
-      </w:r>
-      <w:proofErr w:type="spellEnd"/>
-      <w:r>
-        <w:t>.</w:t>
+        <w:t>L.</w:t>
       </w:r>
     </w:p>
     <w:p>
       <w:r>
-        <w:t xml:space="preserve">The chapter compares three existing systems: </w:t>
-      </w:r>
-      <w:proofErr w:type="spellStart"/>
-      <w:r>
-        <w:t>InPlace</w:t>
-      </w:r>
-      <w:proofErr w:type="spellEnd"/>
-      <w:r>
-        <w:t xml:space="preserve">, Sonia Online and </w:t>
-      </w:r>
-      <w:proofErr w:type="spellStart"/>
-      <w:r>
-        <w:t>PebblePad</w:t>
-      </w:r>
-      <w:proofErr w:type="spellEnd"/>
-      <w:r>
-        <w:t xml:space="preserve">/Mahara-style </w:t>
-      </w:r>
-      <w:proofErr w:type="spellStart"/>
-      <w:r>
-        <w:t>ePortfolio</w:t>
-      </w:r>
-      <w:proofErr w:type="spellEnd"/>
-      <w:r>
-        <w:t xml:space="preserve"> tools, against the project’s needs. It also considers cloud delivery, database-backed web applications, role-based access and secure document upload. The findings are used to define a practical research gap and guide </w:t>
-      </w:r>
-      <w:proofErr w:type="spellStart"/>
-      <w:r>
-        <w:t>TrackWIL’s</w:t>
-      </w:r>
-      <w:proofErr w:type="spellEnd"/>
-      <w:r>
-        <w:t xml:space="preserve"> proposed technical direction</w:t>
+        <w:t>The chapter compares three existing systems: InPlace, Sonia Online and PebblePad/Mahara-style ePortfolio tools, against the project’s needs. It also considers cloud delivery, database-backed web applications, role-based access and secure document upload. The findings are used to define a practical research gap and guide TrackWIL’s proposed technical direction</w:t>
       </w:r>
     </w:p>
     <w:p>
@@ -91,15 +51,7 @@
     </w:p>
     <w:p>
       <w:r>
-        <w:t xml:space="preserve">Work-Integrated Learning connects academic learning with practical workplace experience. Technology can support WIL in different ways: it may deliver learning activities, or it may provide administrative support for placements, communication, evidence collection and assessment. Schuster and Glavas (2017) explain that electronic WIL covers a range of technology uses rather than one single model. For </w:t>
-      </w:r>
-      <w:proofErr w:type="spellStart"/>
-      <w:r>
-        <w:t>TrackWIL</w:t>
-      </w:r>
-      <w:proofErr w:type="spellEnd"/>
-      <w:r>
-        <w:t>, the administrative role is especially relevant because the project focuses on daily activity records, evidence submission, mentor verification and progress monitoring.</w:t>
+        <w:t>Work-Integrated Learning connects academic learning with practical workplace experience. Technology can support WIL in different ways: it may deliver learning activities, or it may provide administrative support for placements, communication, evidence collection and assessment. Schuster and Glavas (2017) explain that electronic WIL covers a range of technology uses rather than one single model. For TrackWIL, the administrative role is especially relevant because the project focuses on daily activity records, evidence submission, mentor verification and progress monitoring.</w:t>
       </w:r>
     </w:p>
     <w:p>
@@ -109,58 +61,18 @@
     </w:p>
     <w:p>
       <w:r>
-        <w:t xml:space="preserve">Industry systems show that placement management commonly involves centralized records, user portals, communication, compliance and reporting. </w:t>
-      </w:r>
-      <w:proofErr w:type="spellStart"/>
-      <w:r>
-        <w:t>InPlace</w:t>
-      </w:r>
-      <w:proofErr w:type="spellEnd"/>
-      <w:r>
-        <w:t xml:space="preserve"> describes tools for central placement visibility, student portals, </w:t>
+        <w:t xml:space="preserve">Industry systems show that placement management commonly involves centralized records, user portals, communication, compliance and reporting. InPlace describes tools for central placement visibility, student portals, </w:t>
       </w:r>
       <w:r>
         <w:t>time sheets</w:t>
       </w:r>
       <w:r>
-        <w:t>, communications, compliance and analytics (</w:t>
-      </w:r>
-      <w:proofErr w:type="spellStart"/>
-      <w:r>
-        <w:t>InPlace</w:t>
-      </w:r>
-      <w:proofErr w:type="spellEnd"/>
-      <w:r>
-        <w:t xml:space="preserve"> Software, n.d.). Sonia Online describes itself as a placement management system containing placement information and paperwork for students and host organizations (Sonia Online, n.d.). These examples show that digital coordination is an established approach, although their exact configuration and available functions depend on the institution using them.</w:t>
+        <w:t>, communications, compliance and analytics (InPlace Software, n.d.). Sonia Online describes itself as a placement management system containing placement information and paperwork for students and host organizations (Sonia Online, n.d.). These examples show that digital coordination is an established approach, although their exact configuration and available functions depend on the institution using them.</w:t>
       </w:r>
     </w:p>
     <w:p>
       <w:r>
-        <w:t xml:space="preserve">Portfolio platforms also provide relevant ideas for collecting and reviewing evidence. Mahara allows learners to upload evidence, reflect on experiences, share portfolios with selected people and receive feedback (Mahara, n.d.). </w:t>
-      </w:r>
-      <w:proofErr w:type="spellStart"/>
-      <w:r>
-        <w:t>PebblePad’s</w:t>
-      </w:r>
-      <w:proofErr w:type="spellEnd"/>
-      <w:r>
-        <w:t xml:space="preserve"> ATLAS assessment area supports assessors in accessing and reviewing learners’ work (</w:t>
-      </w:r>
-      <w:proofErr w:type="spellStart"/>
-      <w:r>
-        <w:t>PebblePad</w:t>
-      </w:r>
-      <w:proofErr w:type="spellEnd"/>
-      <w:r>
-        <w:t xml:space="preserve">, 2026). These features are relevant to </w:t>
-      </w:r>
-      <w:proofErr w:type="spellStart"/>
-      <w:r>
-        <w:t>TrackWIL’s</w:t>
-      </w:r>
-      <w:proofErr w:type="spellEnd"/>
-      <w:r>
-        <w:t xml:space="preserve"> evidence and </w:t>
+        <w:t xml:space="preserve">Portfolio platforms also provide relevant ideas for collecting and reviewing evidence. Mahara allows learners to upload evidence, reflect on experiences, share portfolios with selected people and receive feedback (Mahara, n.d.). PebblePad’s ATLAS assessment area supports assessors in accessing and reviewing learners’ work (PebblePad, 2026). These features are relevant to TrackWIL’s evidence and </w:t>
       </w:r>
       <w:r>
         <w:lastRenderedPageBreak/>
@@ -169,15 +81,7 @@
     </w:p>
     <w:p>
       <w:r>
-        <w:t xml:space="preserve">Overall, the literature and industry examples support a centralized digital workflow, clear communication, evidence management and timely feedback. However, </w:t>
-      </w:r>
-      <w:proofErr w:type="spellStart"/>
-      <w:r>
-        <w:t>TrackWIL</w:t>
-      </w:r>
-      <w:proofErr w:type="spellEnd"/>
-      <w:r>
-        <w:t xml:space="preserve"> must still be evaluated against its specific project requirements, including daily submissions, mentor approval or rejection, feedback, role-specific dashboards and a visible list of outstanding work. Product websites describe vendor-provided capabilities; they should not be treated as independent proof that a system will improve outcomes in every setting.</w:t>
+        <w:t>Overall, the literature and industry examples support a centralized digital workflow, clear communication, evidence management and timely feedback. However, TrackWIL must still be evaluated against its specific project requirements, including daily submissions, mentor approval or rejection, feedback, role-specific dashboards and a visible list of outstanding work. Product websites describe vendor-provided capabilities; they should not be treated as independent proof that a system will improve outcomes in every setting.</w:t>
       </w:r>
     </w:p>
     <w:p>
@@ -190,23 +94,7 @@
     </w:p>
     <w:p>
       <w:r>
-        <w:t xml:space="preserve">Three relevant systems were reviewed: </w:t>
-      </w:r>
-      <w:proofErr w:type="spellStart"/>
-      <w:r>
-        <w:t>InPlace</w:t>
-      </w:r>
-      <w:proofErr w:type="spellEnd"/>
-      <w:r>
-        <w:t>, Sonia Online and Mahara/</w:t>
-      </w:r>
-      <w:proofErr w:type="spellStart"/>
-      <w:r>
-        <w:t>PebblePad</w:t>
-      </w:r>
-      <w:proofErr w:type="spellEnd"/>
-      <w:r>
-        <w:t>. The comparison below is based on publicly available product information, not on hands-on testing. Features may vary by institution, subscription or local configuration.</w:t>
+        <w:t>Three relevant systems were reviewed: InPlace, Sonia Online and Mahara/PebblePad. The comparison below is based on publicly available product information, not on hands-on testing. Features may vary by institution, subscription or local configuration.</w:t>
       </w:r>
     </w:p>
     <w:p>
@@ -217,89 +105,25 @@
         <w:t>:</w:t>
       </w:r>
       <w:r>
-        <w:t xml:space="preserve"> </w:t>
-      </w:r>
-      <w:proofErr w:type="spellStart"/>
-      <w:r>
-        <w:t>InPlace</w:t>
-      </w:r>
-      <w:proofErr w:type="spellEnd"/>
-      <w:r>
-        <w:t xml:space="preserve">: </w:t>
-      </w:r>
-      <w:proofErr w:type="spellStart"/>
-      <w:r>
-        <w:t>InPlace</w:t>
-      </w:r>
-      <w:proofErr w:type="spellEnd"/>
-      <w:r>
-        <w:t xml:space="preserve"> is designed for higher-education placement management. Its stated features include </w:t>
+        <w:t xml:space="preserve"> InPlace: InPlace is designed for higher-education placement management. Its stated features include </w:t>
       </w:r>
       <w:r>
         <w:t>centralized</w:t>
       </w:r>
       <w:r>
-        <w:t xml:space="preserve"> placement management, student portals, </w:t>
-      </w:r>
-      <w:proofErr w:type="gramStart"/>
-      <w:r>
-        <w:t>timesheets</w:t>
-      </w:r>
-      <w:proofErr w:type="gramEnd"/>
-      <w:r>
-        <w:t xml:space="preserve"> and schedules, communications, compliance management, integrations and reporting (</w:t>
-      </w:r>
-      <w:proofErr w:type="spellStart"/>
-      <w:r>
-        <w:t>InPlace</w:t>
-      </w:r>
-      <w:proofErr w:type="spellEnd"/>
-      <w:r>
-        <w:t xml:space="preserve"> Software, n.d.). Its strength is broad administration and visibility across placements. A limitation for this comparison is that its public description </w:t>
+        <w:t xml:space="preserve"> placement management, student portals, timesheets and schedules, communications, compliance management, integrations and reporting (InPlace Software, n.d.). Its strength is broad administration and visibility across placements. A limitation for this comparison is that its public description </w:t>
       </w:r>
       <w:r>
         <w:t>emphasizes</w:t>
       </w:r>
       <w:r>
-        <w:t xml:space="preserve"> placement allocation, compliance and </w:t>
-      </w:r>
-      <w:proofErr w:type="spellStart"/>
-      <w:r>
-        <w:t>programme</w:t>
-      </w:r>
-      <w:proofErr w:type="spellEnd"/>
-      <w:r>
-        <w:t xml:space="preserve">-level management; it does not establish that every </w:t>
-      </w:r>
-      <w:proofErr w:type="spellStart"/>
-      <w:r>
-        <w:t>TrackWIL</w:t>
-      </w:r>
-      <w:proofErr w:type="spellEnd"/>
-      <w:r>
-        <w:t xml:space="preserve">-specific daily logbook or mentor-signing workflow is available in a particular deployment. Lesson for </w:t>
-      </w:r>
-      <w:proofErr w:type="spellStart"/>
-      <w:r>
-        <w:t>TrackWIL</w:t>
-      </w:r>
-      <w:proofErr w:type="spellEnd"/>
-      <w:r>
-        <w:t xml:space="preserve">: </w:t>
+        <w:t xml:space="preserve"> placement allocation, compliance and programme-level management; it does not establish that every TrackWIL-specific daily logbook or mentor-signing workflow is available in a particular deployment. Lesson for TrackWIL: </w:t>
       </w:r>
       <w:r>
         <w:t>centralize</w:t>
       </w:r>
       <w:r>
-        <w:t xml:space="preserve"> records and provide role-appropriate </w:t>
-      </w:r>
-      <w:proofErr w:type="gramStart"/>
-      <w:r>
-        <w:t>views, but</w:t>
-      </w:r>
-      <w:proofErr w:type="gramEnd"/>
-      <w:r>
-        <w:t xml:space="preserve"> </w:t>
+        <w:t xml:space="preserve"> records and provide role-appropriate views, but </w:t>
       </w:r>
       <w:r>
         <w:t>prioritize</w:t>
@@ -322,15 +146,7 @@
         <w:t>organizations</w:t>
       </w:r>
       <w:r>
-        <w:t xml:space="preserve">, with placement information and paperwork available through the system (Sonia Online, n.d.). Its strength is that it directly targets placement coordination and provides access for relevant placement participants. Its limitations cannot be fully assessed from the public landing page alone, and access or features may differ between institutions. Lesson for </w:t>
-      </w:r>
-      <w:proofErr w:type="spellStart"/>
-      <w:r>
-        <w:t>TrackWIL</w:t>
-      </w:r>
-      <w:proofErr w:type="spellEnd"/>
-      <w:r>
-        <w:t xml:space="preserve">: make student and mentor access straightforward and keep placement paperwork in one </w:t>
+        <w:t xml:space="preserve">, with placement information and paperwork available through the system (Sonia Online, n.d.). Its strength is that it directly targets placement coordination and provides access for relevant placement participants. Its limitations cannot be fully assessed from the public landing page alone, and access or features may differ between institutions. Lesson for TrackWIL: make student and mentor access straightforward and keep placement paperwork in one </w:t>
       </w:r>
       <w:r>
         <w:t>organized</w:t>
@@ -347,76 +163,12 @@
         <w:t>:</w:t>
       </w:r>
       <w:r>
-        <w:t xml:space="preserve"> Mahara / </w:t>
-      </w:r>
-      <w:proofErr w:type="spellStart"/>
-      <w:r>
-        <w:t>PebblePad</w:t>
-      </w:r>
-      <w:proofErr w:type="spellEnd"/>
-      <w:r>
-        <w:t xml:space="preserve">: Mahara supports evidence-based portfolios, reflection, sharing and feedback (Mahara, n.d.). </w:t>
-      </w:r>
-      <w:proofErr w:type="spellStart"/>
-      <w:r>
-        <w:t>PebblePad’s</w:t>
-      </w:r>
-      <w:proofErr w:type="spellEnd"/>
-      <w:r>
-        <w:t xml:space="preserve"> ATLAS area supports access to learner submissions and assessment (</w:t>
-      </w:r>
-      <w:proofErr w:type="spellStart"/>
-      <w:r>
-        <w:t>PebblePad</w:t>
-      </w:r>
-      <w:proofErr w:type="spellEnd"/>
-      <w:r>
-        <w:t xml:space="preserve">, 2026). Their strengths are evidence collection, sharing and review. A limitation relative to </w:t>
-      </w:r>
-      <w:proofErr w:type="spellStart"/>
-      <w:r>
-        <w:t>TrackWIL</w:t>
-      </w:r>
-      <w:proofErr w:type="spellEnd"/>
-      <w:r>
-        <w:t xml:space="preserve"> is that portfolio and assessment workflows may not, by themselves, provide the project’s complete set of daily WIL status controls, outstanding-document monitoring and separate coordinator and lecturer dashboards. Lesson for </w:t>
-      </w:r>
-      <w:proofErr w:type="spellStart"/>
-      <w:r>
-        <w:t>TrackWIL</w:t>
-      </w:r>
-      <w:proofErr w:type="spellEnd"/>
-      <w:r>
-        <w:t>: connect each uploaded evidence item to a dated activity, submission status, mentor feedback and progress overview.</w:t>
+        <w:t xml:space="preserve"> Mahara / PebblePad: Mahara supports evidence-based portfolios, reflection, sharing and feedback (Mahara, n.d.). PebblePad’s ATLAS area supports access to learner submissions and assessment (PebblePad, 2026). Their strengths are evidence collection, sharing and review. A limitation relative to TrackWIL is that portfolio and assessment workflows may not, by themselves, provide the project’s complete set of daily WIL status controls, outstanding-document monitoring and separate coordinator and lecturer dashboards. Lesson for TrackWIL: connect each uploaded evidence item to a dated activity, submission status, mentor feedback and progress overview.</w:t>
       </w:r>
     </w:p>
     <w:p>
       <w:r>
-        <w:t xml:space="preserve">Comparative summary: </w:t>
-      </w:r>
-      <w:proofErr w:type="spellStart"/>
-      <w:r>
-        <w:t>InPlace</w:t>
-      </w:r>
-      <w:proofErr w:type="spellEnd"/>
-      <w:r>
-        <w:t xml:space="preserve"> is strongest as a broad placement-management platform; Sonia Online is a directly relevant placement-information and paperwork system; Mahara/</w:t>
-      </w:r>
-      <w:proofErr w:type="spellStart"/>
-      <w:r>
-        <w:t>PebblePad</w:t>
-      </w:r>
-      <w:proofErr w:type="spellEnd"/>
-      <w:r>
-        <w:t xml:space="preserve"> provide useful portfolio and assessment patterns. </w:t>
-      </w:r>
-      <w:proofErr w:type="spellStart"/>
-      <w:r>
-        <w:t>TrackWIL</w:t>
-      </w:r>
-      <w:proofErr w:type="spellEnd"/>
-      <w:r>
-        <w:t xml:space="preserve"> draws on these ideas but will focus its scope on </w:t>
+        <w:t xml:space="preserve">Comparative summary: InPlace is strongest as a broad placement-management platform; Sonia Online is a directly relevant placement-information and paperwork system; Mahara/PebblePad provide useful portfolio and assessment patterns. TrackWIL draws on these ideas but will focus its scope on </w:t>
       </w:r>
       <w:r>
         <w:lastRenderedPageBreak/>
@@ -443,15 +195,7 @@
     </w:p>
     <w:p>
       <w:r>
-        <w:t xml:space="preserve">Authentication and role-based access: </w:t>
-      </w:r>
-      <w:proofErr w:type="spellStart"/>
-      <w:r>
-        <w:t>TrackWIL</w:t>
-      </w:r>
-      <w:proofErr w:type="spellEnd"/>
-      <w:r>
-        <w:t xml:space="preserve"> handles student records and workplace evidence, so users should authenticate before accessing protected information. Authorization should restrict users to the records and actions needed for their roles</w:t>
+        <w:t>Authentication and role-based access: TrackWIL handles student records and workplace evidence, so users should authenticate before accessing protected information. Authorization should restrict users to the records and actions needed for their roles</w:t>
       </w:r>
       <w:r>
         <w:t xml:space="preserve">, </w:t>
@@ -462,15 +206,7 @@
     </w:p>
     <w:p>
       <w:r>
-        <w:t xml:space="preserve">Document upload and storage: Evidence upload is a core feature, but uploaded files create security and storage risks. OWASP recommends allowing only necessary file types, validating file types rather than trusting a supplied content-type value, limiting file size, generating safe stored filenames, and ensuring only authorized users can access uploads (OWASP Foundation, n.d.). </w:t>
-      </w:r>
-      <w:proofErr w:type="spellStart"/>
-      <w:r>
-        <w:t>TrackWIL</w:t>
-      </w:r>
-      <w:proofErr w:type="spellEnd"/>
-      <w:r>
-        <w:t xml:space="preserve"> should also use protected storage, controlled download links, appropriate backups and clear rules for retention and deletion.</w:t>
+        <w:t>Document upload and storage: Evidence upload is a core feature, but uploaded files create security and storage risks. OWASP recommends allowing only necessary file types, validating file types rather than trusting a supplied content-type value, limiting file size, generating safe stored filenames, and ensuring only authorized users can access uploads (OWASP Foundation, n.d.). TrackWIL should also use protected storage, controlled download links, appropriate backups and clear rules for retention and deletion.</w:t>
       </w:r>
     </w:p>
     <w:p>
@@ -480,15 +216,7 @@
     </w:p>
     <w:p>
       <w:r>
-        <w:t xml:space="preserve">Usability and testing: The application should make submission status easy to understand and </w:t>
-      </w:r>
-      <w:proofErr w:type="spellStart"/>
-      <w:r>
-        <w:t>minimise</w:t>
-      </w:r>
-      <w:proofErr w:type="spellEnd"/>
-      <w:r>
-        <w:t xml:space="preserve"> unnecessary steps for students and mentors. Testing should cover successful and unsuccessful logins, role permissions, document upload validation, submission and review status </w:t>
+        <w:t xml:space="preserve">Usability and testing: The application should make submission status easy to understand and minimise unnecessary steps for students and mentors. Testing should cover successful and unsuccessful logins, role permissions, document upload validation, submission and review status </w:t>
       </w:r>
       <w:r>
         <w:lastRenderedPageBreak/>
@@ -510,15 +238,7 @@
     </w:p>
     <w:p>
       <w:r>
-        <w:t xml:space="preserve">The project-specific gap addressed by </w:t>
-      </w:r>
-      <w:proofErr w:type="spellStart"/>
-      <w:r>
-        <w:t>TrackWIL</w:t>
-      </w:r>
-      <w:proofErr w:type="spellEnd"/>
-      <w:r>
-        <w:t xml:space="preserve"> is the need for a focused, integrated workflow aligned with the requirements described in Chapter 1: students record daily WIL activities and upload evidence; mentors review submissions, provide feedback and approve or reject them; and coordinators and lecturers monitor verification status and identify outstanding work through role-specific dashboards.</w:t>
+        <w:t>The project-specific gap addressed by TrackWIL is the need for a focused, integrated workflow aligned with the requirements described in Chapter 1: students record daily WIL activities and upload evidence; mentors review submissions, provide feedback and approve or reject them; and coordinators and lecturers monitor verification status and identify outstanding work through role-specific dashboards.</w:t>
       </w:r>
     </w:p>
     <w:p>
@@ -528,15 +248,7 @@
     </w:p>
     <w:p>
       <w:r>
-        <w:t xml:space="preserve">The project evaluation should investigate whether users can submit and verify documentation more clearly and whether staff can identify outstanding work more easily. This gap and evaluation focus </w:t>
-      </w:r>
-      <w:proofErr w:type="gramStart"/>
-      <w:r>
-        <w:t>align</w:t>
-      </w:r>
-      <w:proofErr w:type="gramEnd"/>
-      <w:r>
-        <w:t xml:space="preserve"> with the aim and objectives in Chapter 1.</w:t>
+        <w:t>The project evaluation should investigate whether users can submit and verify documentation more clearly and whether staff can identify outstanding work more easily. This gap and evaluation focus align with the aim and objectives in Chapter 1.</w:t>
       </w:r>
     </w:p>
     <w:p>
@@ -548,21 +260,14 @@
       </w:r>
     </w:p>
     <w:p>
-      <w:proofErr w:type="spellStart"/>
       <w:r>
-        <w:t>TrackWIL</w:t>
+        <w:t xml:space="preserve">TrackWIL will follow a centralized, role-based workflow. A student creates a dated WIL activity, completes the required documentation and attaches supporting evidence. The student submits the entry to the assigned workplace mentor. The mentor reviews it and either approves it or rejects it with feedback. The system records the current status so the student can see the outcome, while coordinators and lecturers use dashboards to identify submitted, pending, rejected, </w:t>
       </w:r>
-      <w:proofErr w:type="spellEnd"/>
       <w:r>
-        <w:t xml:space="preserve"> will follow a centralized, role-based workflow. A student creates a dated WIL activity, completes the required documentation and attaches supporting evidence. The student submits the entry to the assigned workplace mentor. The mentor reviews it and either approves it or rejects it with feedback. The system records the </w:t>
+        <w:t>approved</w:t>
       </w:r>
-      <w:proofErr w:type="gramStart"/>
       <w:r>
-        <w:t>current status</w:t>
-      </w:r>
-      <w:proofErr w:type="gramEnd"/>
-      <w:r>
-        <w:t xml:space="preserve"> so the student can see the outcome, while coordinators and lecturers use dashboards to identify submitted, pending, rejected, verified and outstanding work.</w:t>
+        <w:t xml:space="preserve"> and outstanding work.</w:t>
       </w:r>
     </w:p>
     <w:p>
@@ -589,44 +294,12 @@
     </w:p>
     <w:p>
       <w:r>
-        <w:t xml:space="preserve">This chapter reviewed research on electronic WIL and placement supervision, and compared </w:t>
-      </w:r>
-      <w:proofErr w:type="spellStart"/>
-      <w:r>
-        <w:t>InPlace</w:t>
-      </w:r>
-      <w:proofErr w:type="spellEnd"/>
-      <w:r>
-        <w:t xml:space="preserve">, Sonia Online and portfolio/assessment tools such as Mahara and </w:t>
-      </w:r>
-      <w:proofErr w:type="spellStart"/>
-      <w:r>
-        <w:t>PebblePad</w:t>
-      </w:r>
-      <w:proofErr w:type="spellEnd"/>
-      <w:r>
-        <w:t>. The review found useful patterns in centralized placement information, evidence collection, submission review, feedback, compliance and reporting. It also highlighted technical considerations involving relational data, authentication, role-based access, safe file uploads, hosting and usability.</w:t>
+        <w:t>This chapter reviewed research on electronic WIL and placement supervision, and compared InPlace, Sonia Online and portfolio/assessment tools such as Mahara and PebblePad. The review found useful patterns in centralized placement information, evidence collection, submission review, feedback, compliance and reporting. It also highlighted technical considerations involving relational data, authentication, role-based access, safe file uploads, hosting and usability.</w:t>
       </w:r>
     </w:p>
     <w:p>
       <w:r>
-        <w:t xml:space="preserve">The research gap is a project-specific integrated workflow that matches </w:t>
-      </w:r>
-      <w:proofErr w:type="spellStart"/>
-      <w:r>
-        <w:t>TrackWIL’s</w:t>
-      </w:r>
-      <w:proofErr w:type="spellEnd"/>
-      <w:r>
-        <w:t xml:space="preserve"> stated needs for daily activity logging, evidence submission, mentor verification and role-specific progress monitoring. These findings inform the functional requirements and technical design in the next project stages. </w:t>
-      </w:r>
-      <w:proofErr w:type="spellStart"/>
-      <w:r>
-        <w:t>TrackWIL’s</w:t>
-      </w:r>
-      <w:proofErr w:type="spellEnd"/>
-      <w:r>
-        <w:t xml:space="preserve"> effectiveness must be established through testing and evaluation rather than assumed.</w:t>
+        <w:t>The research gap is a project-specific integrated workflow that matches TrackWIL’s stated needs for daily activity logging, evidence submission, mentor verification and role-specific progress monitoring. These findings inform the functional requirements and technical design in the next project stages. TrackWIL’s effectiveness must be established through testing and evaluation rather than assumed.</w:t>
       </w:r>
     </w:p>
     <w:sectPr>

</xml_diff>